<commit_message>
updated Buildings of DOOM (edited by Stef, uploaded by me)
</commit_message>
<xml_diff>
--- a/Buildings of DOOM.docx
+++ b/Buildings of DOOM.docx
@@ -18,25 +18,11 @@
     </w:p>
     <w:p/>
     <w:p>
-      <w:pPr>
-        <w:rPr>
-          <w:lang w:val="en-US"/>
-        </w:rPr>
-      </w:pPr>
-      <w:r>
-        <w:rPr>
-          <w:lang w:val="en-US"/>
-        </w:rPr>
+      <w:r>
         <w:t>Luigi, Alen, Stef, Christophe</w:t>
       </w:r>
     </w:p>
-    <w:p>
-      <w:pPr>
-        <w:rPr>
-          <w:lang w:val="en-US"/>
-        </w:rPr>
-      </w:pPr>
-    </w:p>
+    <w:p/>
     <w:p>
       <w:r>
         <w:t>Itch.io link</w:t>
@@ -49,19 +35,7 @@
           <w:rPr>
             <w:rStyle w:val="Hyperlink"/>
           </w:rPr>
-          <w:t>https://godotnet.itch.io/</w:t>
-        </w:r>
-        <w:r>
-          <w:rPr>
-            <w:rStyle w:val="Hyperlink"/>
-          </w:rPr>
-          <w:t>b</w:t>
-        </w:r>
-        <w:r>
-          <w:rPr>
-            <w:rStyle w:val="Hyperlink"/>
-          </w:rPr>
-          <w:t>uilding-of-doom</w:t>
+          <w:t>https://godotnet.itch.io/building-of-doom</w:t>
         </w:r>
       </w:hyperlink>
     </w:p>
@@ -80,33 +54,29 @@
     <w:p/>
     <w:p>
       <w:r>
-        <w:t xml:space="preserve">*Hier schrijf je een korte samenvatting van je spel (1 alinea), met daarin het thema en het </w:t>
-      </w:r>
-      <w:proofErr w:type="gramStart"/>
-      <w:r>
-        <w:t>doel.*</w:t>
-      </w:r>
-      <w:proofErr w:type="gramEnd"/>
+        <w:t xml:space="preserve">Interactief </w:t>
+      </w:r>
+      <w:r>
+        <w:t xml:space="preserve">spel waarbij men probeert zoveel mogelijk gebouwen van de andere spelers hun steden bij elkaar te rapen om zo de overwinning te bemachtigen. </w:t>
+      </w:r>
+    </w:p>
+    <w:p>
+      <w:r>
+        <w:t xml:space="preserve"> </w:t>
+      </w:r>
+    </w:p>
+    <w:p>
+      <w:pPr>
+        <w:pStyle w:val="Kop1"/>
+      </w:pPr>
+      <w:r>
+        <w:t>Materiaal</w:t>
+      </w:r>
     </w:p>
     <w:p/>
     <w:p>
-      <w:pPr>
-        <w:pStyle w:val="Kop1"/>
-      </w:pPr>
-      <w:r>
-        <w:t>Materiaal</w:t>
-      </w:r>
-    </w:p>
-    <w:p/>
-    <w:p>
-      <w:r>
-        <w:t xml:space="preserve">*Een opsomming van alle benodigde </w:t>
-      </w:r>
-      <w:r>
-        <w:t>spelelementen</w:t>
-      </w:r>
-      <w:r>
-        <w:t>*</w:t>
+      <w:r>
+        <w:t>*Een opsomming van alle benodigde spelelementen*</w:t>
       </w:r>
     </w:p>
     <w:p/>
@@ -131,7 +101,13 @@
         </w:numPr>
       </w:pPr>
       <w:r>
-        <w:t xml:space="preserve">Dobbelsteen </w:t>
+        <w:t>Dobbelste</w:t>
+      </w:r>
+      <w:r>
+        <w:t>nen</w:t>
+      </w:r>
+      <w:r>
+        <w:t xml:space="preserve"> </w:t>
       </w:r>
     </w:p>
     <w:p>
@@ -198,13 +174,7 @@
         </w:numPr>
       </w:pPr>
       <w:r>
-        <w:t>Iedereen gooit een dobbelsteen. De speler met de hoogste worp begint. Daarna</w:t>
-      </w:r>
-      <w:r>
-        <w:t xml:space="preserve"> </w:t>
-      </w:r>
-      <w:r>
-        <w:t>speel je met de klok mee</w:t>
+        <w:t>Iedereen gooit een dobbelsteen. De speler met de hoogste worp begint. Daarna speel je met de klok mee</w:t>
       </w:r>
     </w:p>
     <w:p>
@@ -228,15 +198,7 @@
         </w:numPr>
       </w:pPr>
       <w:r>
-        <w:t>Beide spelers leggen 1 kaart gedekt op tafel. (</w:t>
-      </w:r>
-      <w:proofErr w:type="gramStart"/>
-      <w:r>
-        <w:t>aas</w:t>
-      </w:r>
-      <w:proofErr w:type="gramEnd"/>
-      <w:r>
-        <w:t xml:space="preserve"> = laagste)</w:t>
+        <w:t>Beide spelers leggen 1 kaart gedekt op tafel. (aas = laagste)</w:t>
       </w:r>
     </w:p>
     <w:p>
@@ -348,13 +310,7 @@
         </w:numPr>
       </w:pPr>
       <w:r>
-        <w:t>Beide spelers leggen opnieuw 1 kaart gedekt neer en gooien ze opnieuw met een</w:t>
-      </w:r>
-      <w:r>
-        <w:t xml:space="preserve"> </w:t>
-      </w:r>
-      <w:r>
-        <w:t>dobbelsteen, de vorige gelegde kaart blijft op tafel en tel je mee op</w:t>
+        <w:t>Beide spelers leggen opnieuw 1 kaart gedekt neer en gooien ze opnieuw met een dobbelsteen, de vorige gelegde kaart blijft op tafel en tel je mee op</w:t>
       </w:r>
     </w:p>
     <w:p>
@@ -383,13 +339,7 @@
         </w:numPr>
       </w:pPr>
       <w:r>
-        <w:t>Heb je minstens 1 gebouw van elke kleur dat meespeelt, dan krijg je een Revival, je</w:t>
-      </w:r>
-      <w:r>
-        <w:t xml:space="preserve"> </w:t>
-      </w:r>
-      <w:r>
-        <w:t>houdt je gebouwen dus bij, je wisselt niets in</w:t>
+        <w:t>Heb je minstens 1 gebouw van elke kleur dat meespeelt, dan krijg je een Revival, je houdt je gebouwen dus bij, je wisselt niets in</w:t>
       </w:r>
     </w:p>
     <w:p>
@@ -401,13 +351,7 @@
         </w:numPr>
       </w:pPr>
       <w:r>
-        <w:t>Als je dood bent (0 pionnen), dan wissel je je Revival in voor 1 gebouw uit de doos,</w:t>
-      </w:r>
-      <w:r>
-        <w:t xml:space="preserve"> </w:t>
-      </w:r>
-      <w:r>
-        <w:t>je steelt niets van andere spelers</w:t>
+        <w:t>Als je dood bent (0 pionnen), dan wissel je je Revival in voor 1 gebouw uit de doos, je steelt niets van andere spelers</w:t>
       </w:r>
     </w:p>
     <w:p>
@@ -439,15 +383,7 @@
     </w:p>
     <w:p>
       <w:r>
-        <w:t xml:space="preserve">Dit is volledig </w:t>
-      </w:r>
-      <w:proofErr w:type="gramStart"/>
-      <w:r>
-        <w:t>weg gedaan</w:t>
-      </w:r>
-      <w:proofErr w:type="gramEnd"/>
-      <w:r>
-        <w:t xml:space="preserve"> en vervangen met dobbelstenen en kaarten.</w:t>
+        <w:t>Dit is volledig weg gedaan en vervangen met dobbelstenen en kaarten.</w:t>
       </w:r>
     </w:p>
     <w:p/>
@@ -462,6 +398,7 @@
         <w:t>Afbeeldingen en foto's</w:t>
       </w:r>
     </w:p>
+    <w:p/>
     <w:sectPr>
       <w:pgSz w:w="11906" w:h="16838"/>
       <w:pgMar w:top="1440" w:right="1440" w:bottom="1440" w:left="1440" w:header="708" w:footer="708" w:gutter="0"/>
@@ -1562,6 +1499,7 @@
   <w:style w:type="character" w:default="1" w:styleId="Standaardalinea-lettertype">
     <w:name w:val="Default Paragraph Font"/>
     <w:uiPriority w:val="1"/>
+    <w:semiHidden/>
     <w:unhideWhenUsed/>
   </w:style>
   <w:style w:type="table" w:default="1" w:styleId="Standaardtabel">

</xml_diff>

<commit_message>
Word document updated. edited by Stef
</commit_message>
<xml_diff>
--- a/Buildings of DOOM.docx
+++ b/Buildings of DOOM.docx
@@ -30,7 +30,7 @@
     </w:p>
     <w:p/>
     <w:p>
-      <w:hyperlink r:id="rId5" w:tgtFrame="_blank" w:tooltip="https://godotnet.itch.io/building-of-doom" w:history="1">
+      <w:hyperlink r:id="rId6" w:tgtFrame="_blank" w:tooltip="https://godotnet.itch.io/building-of-doom" w:history="1">
         <w:r>
           <w:rPr>
             <w:rStyle w:val="Hyperlink"/>
@@ -57,7 +57,40 @@
         <w:t xml:space="preserve">Interactief </w:t>
       </w:r>
       <w:r>
-        <w:t xml:space="preserve">spel waarbij men probeert zoveel mogelijk gebouwen van de andere spelers hun steden bij elkaar te rapen om zo de overwinning te bemachtigen. </w:t>
+        <w:t xml:space="preserve">spel waarbij men </w:t>
+      </w:r>
+      <w:r>
+        <w:t xml:space="preserve">met behulp van kaarten en dobbelstenen </w:t>
+      </w:r>
+      <w:r>
+        <w:t xml:space="preserve">probeert zoveel mogelijk gebouwen van de andere spelers </w:t>
+      </w:r>
+      <w:r>
+        <w:t>bij el</w:t>
+      </w:r>
+      <w:r>
+        <w:t xml:space="preserve">kaar te </w:t>
+      </w:r>
+      <w:r>
+        <w:t>verdienen. De speler met de meeste punten (= meest aantal veroverde gebouwen)</w:t>
+      </w:r>
+      <w:r>
+        <w:t xml:space="preserve"> </w:t>
+      </w:r>
+      <w:r>
+        <w:t>zal</w:t>
+      </w:r>
+      <w:r>
+        <w:t xml:space="preserve"> de overwinning </w:t>
+      </w:r>
+      <w:r>
+        <w:t>opeisen</w:t>
+      </w:r>
+      <w:r>
+        <w:t xml:space="preserve">. </w:t>
+      </w:r>
+      <w:r>
+        <w:t xml:space="preserve"> </w:t>
       </w:r>
     </w:p>
     <w:p>
@@ -89,7 +122,13 @@
         </w:numPr>
       </w:pPr>
       <w:r>
-        <w:t>Pionnen</w:t>
+        <w:t>6 p</w:t>
+      </w:r>
+      <w:r>
+        <w:t>ionnen</w:t>
+      </w:r>
+      <w:r>
+        <w:t xml:space="preserve"> in verschillende kleuren</w:t>
       </w:r>
     </w:p>
     <w:p>
@@ -101,13 +140,13 @@
         </w:numPr>
       </w:pPr>
       <w:r>
-        <w:t>Dobbelste</w:t>
+        <w:t>2 d</w:t>
+      </w:r>
+      <w:r>
+        <w:t>obbelste</w:t>
       </w:r>
       <w:r>
         <w:t>nen</w:t>
-      </w:r>
-      <w:r>
-        <w:t xml:space="preserve"> </w:t>
       </w:r>
     </w:p>
     <w:p>
@@ -119,7 +158,10 @@
         </w:numPr>
       </w:pPr>
       <w:r>
-        <w:t>Boek kaarten</w:t>
+        <w:t>1 b</w:t>
+      </w:r>
+      <w:r>
+        <w:t>oek kaarten</w:t>
       </w:r>
     </w:p>
     <w:p/>
@@ -140,7 +182,19 @@
         <w:t>Spel Setup/Regels</w:t>
       </w:r>
     </w:p>
-    <w:p/>
+    <w:p>
+      <w:pPr>
+        <w:rPr>
+          <w:u w:val="single"/>
+        </w:rPr>
+      </w:pPr>
+      <w:r>
+        <w:rPr>
+          <w:u w:val="single"/>
+        </w:rPr>
+        <w:t>Opzet van het spel:</w:t>
+      </w:r>
+    </w:p>
     <w:p>
       <w:pPr>
         <w:pStyle w:val="Lijstalinea"/>
@@ -150,7 +204,22 @@
         </w:numPr>
       </w:pPr>
       <w:r>
-        <w:t>Deel 4 kaarten per persoon uit. Gebruik geen jokers en geen beeldkaarten</w:t>
+        <w:t>Elke speler ontvangt 4 kaarten, de spelers mogen hun eigen kaarten bekijken.</w:t>
+      </w:r>
+      <w:r>
+        <w:t xml:space="preserve"> </w:t>
+      </w:r>
+      <w:r>
+        <w:br/>
+      </w:r>
+      <w:r>
+        <w:t xml:space="preserve">Er worden </w:t>
+      </w:r>
+      <w:r>
+        <w:t>geen jokers en geen beeldkaarten</w:t>
+      </w:r>
+      <w:r>
+        <w:t xml:space="preserve"> gebruikt.</w:t>
       </w:r>
     </w:p>
     <w:p>
@@ -162,7 +231,43 @@
         </w:numPr>
       </w:pPr>
       <w:r>
-        <w:t>Geef elke speler 5 pionnen in zijn eigen kleur</w:t>
+        <w:t>E</w:t>
+      </w:r>
+      <w:r>
+        <w:t>lke speler</w:t>
+      </w:r>
+      <w:r>
+        <w:t xml:space="preserve"> </w:t>
+      </w:r>
+      <w:r>
+        <w:t>ontvangt</w:t>
+      </w:r>
+      <w:r>
+        <w:t xml:space="preserve"> bij de start </w:t>
+      </w:r>
+      <w:r>
+        <w:t xml:space="preserve">5 </w:t>
+      </w:r>
+      <w:r>
+        <w:t>gebouwen (</w:t>
+      </w:r>
+      <w:r>
+        <w:t>=</w:t>
+      </w:r>
+      <w:r>
+        <w:t xml:space="preserve"> de </w:t>
+      </w:r>
+      <w:r>
+        <w:t>pionnen</w:t>
+      </w:r>
+      <w:r>
+        <w:t>)</w:t>
+      </w:r>
+      <w:r>
+        <w:t xml:space="preserve"> in zijn eigen kleur</w:t>
+      </w:r>
+      <w:r>
+        <w:t>.</w:t>
       </w:r>
     </w:p>
     <w:p>
@@ -174,7 +279,60 @@
         </w:numPr>
       </w:pPr>
       <w:r>
-        <w:t>Iedereen gooit een dobbelsteen. De speler met de hoogste worp begint. Daarna speel je met de klok mee</w:t>
+        <w:t xml:space="preserve">Iedereen gooit </w:t>
+      </w:r>
+      <w:r>
+        <w:t xml:space="preserve">om de beurt </w:t>
+      </w:r>
+      <w:r>
+        <w:t xml:space="preserve">met </w:t>
+      </w:r>
+      <w:r>
+        <w:t>een dobbelsteen. De speler met de hoogste worp begint</w:t>
+      </w:r>
+      <w:r>
+        <w:t>.</w:t>
+      </w:r>
+      <w:r>
+        <w:br/>
+        <w:t>B</w:t>
+      </w:r>
+      <w:r>
+        <w:t>ij een gelijkspel dobbelen de mensen met de zelfde hoogste waarde opnieuw tot er 1 speler wint</w:t>
+      </w:r>
+      <w:r>
+        <w:t xml:space="preserve">. Daarna </w:t>
+      </w:r>
+      <w:r>
+        <w:t>wordt er met</w:t>
+      </w:r>
+      <w:r>
+        <w:t xml:space="preserve"> met de klok mee</w:t>
+      </w:r>
+      <w:r>
+        <w:t xml:space="preserve"> gespeeld</w:t>
+      </w:r>
+      <w:r>
+        <w:t>.</w:t>
+      </w:r>
+    </w:p>
+    <w:p>
+      <w:pPr>
+        <w:pStyle w:val="Lijstalinea"/>
+      </w:pPr>
+    </w:p>
+    <w:p>
+      <w:pPr>
+        <w:rPr>
+          <w:u w:val="single"/>
+        </w:rPr>
+      </w:pPr>
+      <w:r>
+        <w:rPr>
+          <w:u w:val="single"/>
+        </w:rPr>
+        <w:lastRenderedPageBreak/>
+        <w:t>Spelverloop:</w:t>
       </w:r>
     </w:p>
     <w:p>
@@ -186,7 +344,19 @@
         </w:numPr>
       </w:pPr>
       <w:r>
-        <w:t>Degene die begint is de aanvaller. Hij kiest een speler tegen wie hij gaat vechten</w:t>
+        <w:t xml:space="preserve">Degene die </w:t>
+      </w:r>
+      <w:r>
+        <w:t>start</w:t>
+      </w:r>
+      <w:r>
+        <w:t xml:space="preserve"> is de aanvaller. Hij kiest een speler </w:t>
+      </w:r>
+      <w:r>
+        <w:t>om uit te dagen</w:t>
+      </w:r>
+      <w:r>
+        <w:t>.</w:t>
       </w:r>
     </w:p>
     <w:p>
@@ -206,7 +376,22 @@
         <w:pStyle w:val="Lijstalinea"/>
       </w:pPr>
       <w:r>
-        <w:t>De aanvaller legt eerst zijn kaart</w:t>
+        <w:t xml:space="preserve">De aanvaller legt </w:t>
+      </w:r>
+      <w:r>
+        <w:t xml:space="preserve">als </w:t>
+      </w:r>
+      <w:r>
+        <w:t>eerst</w:t>
+      </w:r>
+      <w:r>
+        <w:t>e</w:t>
+      </w:r>
+      <w:r>
+        <w:t xml:space="preserve"> zijn kaart</w:t>
+      </w:r>
+      <w:r>
+        <w:t>.</w:t>
       </w:r>
     </w:p>
     <w:p>
@@ -214,7 +399,22 @@
         <w:pStyle w:val="Lijstalinea"/>
       </w:pPr>
       <w:r>
-        <w:t>Heb je 2 of meer kaarten met dezelfde waarde, dan mag je deze samen leggen</w:t>
+        <w:t>Bezit iemand</w:t>
+      </w:r>
+      <w:r>
+        <w:t xml:space="preserve"> 2 of meer kaarten met dezelfde waarde, dan m</w:t>
+      </w:r>
+      <w:r>
+        <w:t>ogen</w:t>
+      </w:r>
+      <w:r>
+        <w:t xml:space="preserve"> deze samen </w:t>
+      </w:r>
+      <w:r>
+        <w:t>afgelegd worden</w:t>
+      </w:r>
+      <w:r>
+        <w:t>.</w:t>
       </w:r>
     </w:p>
     <w:p>
@@ -222,7 +422,10 @@
         <w:pStyle w:val="Lijstalinea"/>
       </w:pPr>
       <w:r>
-        <w:t>Eens er een kaart op tafel ligt, mag deze niet meer worden weggehaald deze ronde</w:t>
+        <w:t>Eens er een kaart op tafel ligt, mag deze niet meer worden weggehaald</w:t>
+      </w:r>
+      <w:r>
+        <w:t>.</w:t>
       </w:r>
     </w:p>
     <w:p>
@@ -234,8 +437,16 @@
         </w:numPr>
       </w:pPr>
       <w:r>
-        <w:lastRenderedPageBreak/>
-        <w:t>Beide spelers gooien een dobbelsteen</w:t>
+        <w:t>Beide spelers gooien</w:t>
+      </w:r>
+      <w:r>
+        <w:t xml:space="preserve"> nadien ook</w:t>
+      </w:r>
+      <w:r>
+        <w:t xml:space="preserve"> een dobbelsteen</w:t>
+      </w:r>
+      <w:r>
+        <w:t>.</w:t>
       </w:r>
     </w:p>
     <w:p>
@@ -247,7 +458,44 @@
         </w:numPr>
       </w:pPr>
       <w:r>
-        <w:t>Draai de kaarten om en tel de waarde van de kaart en de dobbelsteen bij elkaar op.</w:t>
+        <w:t>D</w:t>
+      </w:r>
+      <w:r>
+        <w:t xml:space="preserve">e kaarten </w:t>
+      </w:r>
+      <w:r>
+        <w:t xml:space="preserve">worden nu pas </w:t>
+      </w:r>
+      <w:r>
+        <w:t>om</w:t>
+      </w:r>
+      <w:r>
+        <w:t>gedraaid.</w:t>
+      </w:r>
+      <w:r>
+        <w:t xml:space="preserve"> </w:t>
+      </w:r>
+      <w:r>
+        <w:br/>
+        <w:t>D</w:t>
+      </w:r>
+      <w:r>
+        <w:t xml:space="preserve">e waarde van de kaart en de dobbelsteen </w:t>
+      </w:r>
+      <w:r>
+        <w:t xml:space="preserve">worden </w:t>
+      </w:r>
+      <w:r>
+        <w:t>bij elkaar op</w:t>
+      </w:r>
+      <w:r>
+        <w:t>geteld</w:t>
+      </w:r>
+      <w:r>
+        <w:t>.</w:t>
+      </w:r>
+      <w:r>
+        <w:br/>
       </w:r>
     </w:p>
     <w:p>
@@ -255,7 +503,28 @@
         <w:pStyle w:val="Lijstalinea"/>
       </w:pPr>
       <w:r>
-        <w:t>De speler met de hoogste totale waarde krijgt 1 pion van de tegenspeler</w:t>
+        <w:t xml:space="preserve">De speler met de hoogste totale waarde krijgt 1 </w:t>
+      </w:r>
+      <w:r>
+        <w:t>gebouw</w:t>
+      </w:r>
+      <w:r>
+        <w:t xml:space="preserve"> </w:t>
+      </w:r>
+      <w:r>
+        <w:t xml:space="preserve">(=pion) </w:t>
+      </w:r>
+      <w:r>
+        <w:t xml:space="preserve">van </w:t>
+      </w:r>
+      <w:r>
+        <w:t>zijn</w:t>
+      </w:r>
+      <w:r>
+        <w:t xml:space="preserve"> tegenspeler</w:t>
+      </w:r>
+      <w:r>
+        <w:t>.</w:t>
       </w:r>
     </w:p>
     <w:p>
@@ -263,7 +532,31 @@
         <w:pStyle w:val="Lijstalinea"/>
       </w:pPr>
       <w:r>
-        <w:t>Enkel de pionnen die je wint tellen als punten (1 pion = 1 punt). Deze hou je altijd bij</w:t>
+        <w:t xml:space="preserve">Enkel de </w:t>
+      </w:r>
+      <w:r>
+        <w:t>gebouwe</w:t>
+      </w:r>
+      <w:r>
+        <w:t xml:space="preserve">n die je wint tellen </w:t>
+      </w:r>
+      <w:r>
+        <w:t xml:space="preserve">straks </w:t>
+      </w:r>
+      <w:r>
+        <w:t xml:space="preserve">als punten (1 </w:t>
+      </w:r>
+      <w:r>
+        <w:t>gebouw</w:t>
+      </w:r>
+      <w:r>
+        <w:t xml:space="preserve"> = 1 punt). Deze </w:t>
+      </w:r>
+      <w:r>
+        <w:t>worden apart bewaard</w:t>
+      </w:r>
+      <w:r>
+        <w:t>.</w:t>
       </w:r>
     </w:p>
     <w:p>
@@ -275,7 +568,34 @@
         </w:numPr>
       </w:pPr>
       <w:r>
-        <w:t>Na elk gevecht trek je opnieuw kaarten totdat je weer 4 kaarten in je hand hebt</w:t>
+        <w:t xml:space="preserve">Na elk gevecht </w:t>
+      </w:r>
+      <w:r>
+        <w:t xml:space="preserve">worden de kaarten in de hand aangevuld </w:t>
+      </w:r>
+      <w:r>
+        <w:t xml:space="preserve">totdat </w:t>
+      </w:r>
+      <w:r>
+        <w:t xml:space="preserve">iedereen </w:t>
+      </w:r>
+      <w:r>
+        <w:t xml:space="preserve">weer 4 kaarten in </w:t>
+      </w:r>
+      <w:r>
+        <w:t>de</w:t>
+      </w:r>
+      <w:r>
+        <w:t xml:space="preserve"> hand h</w:t>
+      </w:r>
+      <w:r>
+        <w:t>eef</w:t>
+      </w:r>
+      <w:r>
+        <w:t>t</w:t>
+      </w:r>
+      <w:r>
+        <w:t>.</w:t>
       </w:r>
     </w:p>
     <w:p>
@@ -287,16 +607,61 @@
         </w:numPr>
       </w:pPr>
       <w:r>
-        <w:t>Heb je geen pionnen meer? Dan ben je dood, behalve als je een Revival hebt (lees</w:t>
+        <w:t>Heeft een speler</w:t>
+      </w:r>
+      <w:r>
+        <w:t xml:space="preserve"> geen </w:t>
+      </w:r>
+      <w:r>
+        <w:t>gebouwen</w:t>
+      </w:r>
+      <w:r>
+        <w:t xml:space="preserve"> meer? Dan </w:t>
+      </w:r>
+      <w:r>
+        <w:t xml:space="preserve">is hij </w:t>
+      </w:r>
+      <w:r>
+        <w:t xml:space="preserve">dood, behalve als </w:t>
+      </w:r>
+      <w:r>
+        <w:t xml:space="preserve">hij </w:t>
+      </w:r>
+      <w:r>
+        <w:t>een Revival</w:t>
+      </w:r>
+      <w:r>
+        <w:t xml:space="preserve"> bezit</w:t>
       </w:r>
       <w:r>
         <w:t xml:space="preserve"> </w:t>
       </w:r>
       <w:r>
-        <w:t>onder)</w:t>
-      </w:r>
-    </w:p>
-    <w:p>
+        <w:t xml:space="preserve">. </w:t>
+      </w:r>
+      <w:r>
+        <w:t>(</w:t>
+      </w:r>
+      <w:r>
+        <w:t>verder meer uitleg</w:t>
+      </w:r>
+      <w:r>
+        <w:t>)</w:t>
+      </w:r>
+    </w:p>
+    <w:p>
+      <w:r>
+        <w:rPr>
+          <w:u w:val="single"/>
+        </w:rPr>
+        <w:t>Tijdens het spel:</w:t>
+      </w:r>
+      <w:r>
+        <w:rPr>
+          <w:u w:val="single"/>
+        </w:rPr>
+        <w:br/>
+      </w:r>
       <w:r>
         <w:t>Bij gelijkspel:</w:t>
       </w:r>
@@ -310,7 +675,25 @@
         </w:numPr>
       </w:pPr>
       <w:r>
-        <w:t>Beide spelers leggen opnieuw 1 kaart gedekt neer en gooien ze opnieuw met een dobbelsteen, de vorige gelegde kaart blijft op tafel en tel je mee op</w:t>
+        <w:t xml:space="preserve">Beide spelers leggen opnieuw 1 kaart gedekt </w:t>
+      </w:r>
+      <w:r>
+        <w:t>op de tafel.  Ze gooien</w:t>
+      </w:r>
+      <w:r>
+        <w:t xml:space="preserve"> opnieuw met een dobbelsteen</w:t>
+      </w:r>
+      <w:r>
+        <w:t>.  D</w:t>
+      </w:r>
+      <w:r>
+        <w:t xml:space="preserve">e vorige gelegde kaart blijft op tafel en </w:t>
+      </w:r>
+      <w:r>
+        <w:t>wordt mee verrekend</w:t>
+      </w:r>
+      <w:r>
+        <w:t>.</w:t>
       </w:r>
     </w:p>
     <w:p>
@@ -322,12 +705,47 @@
         </w:numPr>
       </w:pPr>
       <w:r>
-        <w:t>De speler met de hoogste totale waarde wint 1 pion van de tegenstander</w:t>
-      </w:r>
-    </w:p>
-    <w:p>
-      <w:r>
-        <w:t>Revival:</w:t>
+        <w:t xml:space="preserve">De speler met de hoogste totale waarde wint </w:t>
+      </w:r>
+      <w:r>
+        <w:t xml:space="preserve">nu </w:t>
+      </w:r>
+      <w:r>
+        <w:t xml:space="preserve">1 </w:t>
+      </w:r>
+      <w:r>
+        <w:t>gebouw</w:t>
+      </w:r>
+      <w:r>
+        <w:t xml:space="preserve"> van de tegenstander</w:t>
+      </w:r>
+      <w:r>
+        <w:t>.</w:t>
+      </w:r>
+    </w:p>
+    <w:p>
+      <w:r>
+        <w:t xml:space="preserve">Wat is een </w:t>
+      </w:r>
+      <w:r>
+        <w:t>Revival</w:t>
+      </w:r>
+      <w:r>
+        <w:t>?</w:t>
+      </w:r>
+    </w:p>
+    <w:p>
+      <w:pPr>
+        <w:pStyle w:val="Lijstalinea"/>
+      </w:pPr>
+      <w:r>
+        <w:rPr>
+          <w:u w:val="single"/>
+        </w:rPr>
+        <w:t>Opgelet</w:t>
+      </w:r>
+      <w:r>
+        <w:t>: Revival kan enkel vanaf 3 spelers!</w:t>
       </w:r>
     </w:p>
     <w:p>
@@ -339,7 +757,52 @@
         </w:numPr>
       </w:pPr>
       <w:r>
-        <w:t>Heb je minstens 1 gebouw van elke kleur dat meespeelt, dan krijg je een Revival, je houdt je gebouwen dus bij, je wisselt niets in</w:t>
+        <w:t>Wanneer een speler</w:t>
+      </w:r>
+      <w:r>
+        <w:t xml:space="preserve"> minstens</w:t>
+      </w:r>
+      <w:r>
+        <w:t xml:space="preserve"> </w:t>
+      </w:r>
+      <w:r>
+        <w:t xml:space="preserve">1 gebouw van elke </w:t>
+      </w:r>
+      <w:r>
+        <w:t>tegenspeler veroverd heeft</w:t>
+      </w:r>
+      <w:r>
+        <w:t>, dan krijg</w:t>
+      </w:r>
+      <w:r>
+        <w:t>t deze</w:t>
+      </w:r>
+      <w:r>
+        <w:t xml:space="preserve"> een Revival</w:t>
+      </w:r>
+      <w:r>
+        <w:t>-fiche.</w:t>
+      </w:r>
+      <w:r>
+        <w:t xml:space="preserve"> </w:t>
+      </w:r>
+      <w:r>
+        <w:t>Hij</w:t>
+      </w:r>
+      <w:r>
+        <w:t xml:space="preserve"> houdt </w:t>
+      </w:r>
+      <w:r>
+        <w:t>deze</w:t>
+      </w:r>
+      <w:r>
+        <w:t xml:space="preserve"> gebouwen dus bij, </w:t>
+      </w:r>
+      <w:r>
+        <w:t>er wordt niets afgegeven</w:t>
+      </w:r>
+      <w:r>
+        <w:t>.</w:t>
       </w:r>
     </w:p>
     <w:p>
@@ -351,7 +814,59 @@
         </w:numPr>
       </w:pPr>
       <w:r>
-        <w:t>Als je dood bent (0 pionnen), dan wissel je je Revival in voor 1 gebouw uit de doos, je steelt niets van andere spelers</w:t>
+        <w:t>Wanneer een speler</w:t>
+      </w:r>
+      <w:r>
+        <w:t xml:space="preserve"> dood</w:t>
+      </w:r>
+      <w:r>
+        <w:t xml:space="preserve"> is</w:t>
+      </w:r>
+      <w:r>
+        <w:t xml:space="preserve"> (</w:t>
+      </w:r>
+      <w:r>
+        <w:t xml:space="preserve">= </w:t>
+      </w:r>
+      <w:r>
+        <w:t xml:space="preserve">0 </w:t>
+      </w:r>
+      <w:r>
+        <w:t>gebouwen</w:t>
+      </w:r>
+      <w:r>
+        <w:t>)</w:t>
+      </w:r>
+      <w:r>
+        <w:t xml:space="preserve"> én een Revival-fiche in bezit heeft, </w:t>
+      </w:r>
+      <w:r>
+        <w:t>dan wissel</w:t>
+      </w:r>
+      <w:r>
+        <w:t>t hij de fiche</w:t>
+      </w:r>
+      <w:r>
+        <w:t xml:space="preserve"> in voor 1 gebouw</w:t>
+      </w:r>
+      <w:r>
+        <w:t xml:space="preserve"> van zijn eigen kleur</w:t>
+      </w:r>
+      <w:r>
+        <w:t xml:space="preserve"> uit de doos</w:t>
+      </w:r>
+      <w:r>
+        <w:t>.</w:t>
+      </w:r>
+      <w:r>
+        <w:br/>
+        <w:t>Er wordt hierbij geen gebouw afgenomen van</w:t>
+      </w:r>
+      <w:r>
+        <w:t xml:space="preserve"> andere spelers</w:t>
+      </w:r>
+      <w:r>
+        <w:t>.</w:t>
       </w:r>
     </w:p>
     <w:p>
@@ -365,6 +880,69 @@
       <w:r>
         <w:t>Een Revival kan maar 1 keer gebruikt worden</w:t>
       </w:r>
+      <w:r>
+        <w:t xml:space="preserve"> en elke speler kan maar 1 </w:t>
+      </w:r>
+      <w:r>
+        <w:t>R</w:t>
+      </w:r>
+      <w:r>
+        <w:t>evival krijgen</w:t>
+      </w:r>
+      <w:r>
+        <w:t>.</w:t>
+      </w:r>
+    </w:p>
+    <w:p>
+      <w:pPr>
+        <w:rPr>
+          <w:u w:val="single"/>
+        </w:rPr>
+      </w:pPr>
+      <w:r>
+        <w:rPr>
+          <w:u w:val="single"/>
+        </w:rPr>
+        <w:t>Einde van het spel:</w:t>
+      </w:r>
+    </w:p>
+    <w:p>
+      <w:pPr>
+        <w:ind w:left="708"/>
+      </w:pPr>
+      <w:r>
+        <w:t xml:space="preserve">Wanneer er nog 1 speler overblijft wordt het spel beëindigd, dan worden </w:t>
+      </w:r>
+      <w:r>
+        <w:t>alle</w:t>
+      </w:r>
+      <w:r>
+        <w:t xml:space="preserve"> punten opgeteld:</w:t>
+      </w:r>
+    </w:p>
+    <w:p>
+      <w:pPr>
+        <w:ind w:left="708"/>
+      </w:pPr>
+      <w:r>
+        <w:tab/>
+        <w:t>Elk veroverd gebouw is 1 punt waard</w:t>
+      </w:r>
+      <w:r>
+        <w:t>.</w:t>
+      </w:r>
+    </w:p>
+    <w:p>
+      <w:pPr>
+        <w:ind w:left="708"/>
+      </w:pPr>
+      <w:r>
+        <w:tab/>
+        <w:t>De overgebleven persoon krijgt 1 bonuspunt</w:t>
+      </w:r>
+      <w:r>
+        <w:t>.</w:t>
+      </w:r>
     </w:p>
     <w:p/>
     <w:p>
@@ -383,6 +961,7 @@
     </w:p>
     <w:p>
       <w:r>
+        <w:lastRenderedPageBreak/>
         <w:t>Dit is volledig weg gedaan en vervangen met dobbelstenen en kaarten.</w:t>
       </w:r>
     </w:p>
@@ -392,13 +971,176 @@
         <w:t>Bijlages</w:t>
       </w:r>
     </w:p>
-    <w:p/>
     <w:p>
       <w:r>
         <w:t>Afbeeldingen en foto's</w:t>
       </w:r>
     </w:p>
-    <w:p/>
+    <w:p>
+      <w:pPr>
+        <w:rPr>
+          <w:noProof/>
+        </w:rPr>
+      </w:pPr>
+      <w:r>
+        <w:rPr>
+          <w:noProof/>
+        </w:rPr>
+        <w:drawing>
+          <wp:inline distT="0" distB="0" distL="0" distR="0" wp14:anchorId="6E75D757" wp14:editId="3C5ED95D">
+            <wp:extent cx="2857881" cy="3596640"/>
+            <wp:effectExtent l="0" t="0" r="0" b="3810"/>
+            <wp:docPr id="307469393" name="Afbeelding 4"/>
+            <wp:cNvGraphicFramePr>
+              <a:graphicFrameLocks xmlns:a="http://schemas.openxmlformats.org/drawingml/2006/main" noChangeAspect="1"/>
+            </wp:cNvGraphicFramePr>
+            <a:graphic xmlns:a="http://schemas.openxmlformats.org/drawingml/2006/main">
+              <a:graphicData uri="http://schemas.openxmlformats.org/drawingml/2006/picture">
+                <pic:pic xmlns:pic="http://schemas.openxmlformats.org/drawingml/2006/picture">
+                  <pic:nvPicPr>
+                    <pic:cNvPr id="307469393" name="Afbeelding 307469393"/>
+                    <pic:cNvPicPr/>
+                  </pic:nvPicPr>
+                  <pic:blipFill rotWithShape="1">
+                    <a:blip r:embed="rId7">
+                      <a:extLst>
+                        <a:ext uri="{28A0092B-C50C-407E-A947-70E740481C1C}">
+                          <a14:useLocalDpi xmlns:a14="http://schemas.microsoft.com/office/drawing/2010/main" val="0"/>
+                        </a:ext>
+                      </a:extLst>
+                    </a:blip>
+                    <a:srcRect t="11018" b="18339"/>
+                    <a:stretch>
+                      <a:fillRect/>
+                    </a:stretch>
+                  </pic:blipFill>
+                  <pic:spPr bwMode="auto">
+                    <a:xfrm>
+                      <a:off x="0" y="0"/>
+                      <a:ext cx="2871098" cy="3613273"/>
+                    </a:xfrm>
+                    <a:prstGeom prst="rect">
+                      <a:avLst/>
+                    </a:prstGeom>
+                    <a:ln>
+                      <a:noFill/>
+                    </a:ln>
+                    <a:extLst>
+                      <a:ext uri="{53640926-AAD7-44D8-BBD7-CCE9431645EC}">
+                        <a14:shadowObscured xmlns:a14="http://schemas.microsoft.com/office/drawing/2010/main"/>
+                      </a:ext>
+                    </a:extLst>
+                  </pic:spPr>
+                </pic:pic>
+              </a:graphicData>
+            </a:graphic>
+          </wp:inline>
+        </w:drawing>
+      </w:r>
+      <w:r>
+        <w:rPr>
+          <w:noProof/>
+        </w:rPr>
+        <w:drawing>
+          <wp:inline distT="0" distB="0" distL="0" distR="0" wp14:anchorId="68DACF2C" wp14:editId="0F6F6988">
+            <wp:extent cx="2011680" cy="3583789"/>
+            <wp:effectExtent l="0" t="0" r="7620" b="0"/>
+            <wp:docPr id="992045914" name="Afbeelding 5" descr="Afbeelding met Kaartspel, Karmijn, Games, overdekt&#10;&#10;Door AI gegenereerde inhoud is mogelijk onjuist."/>
+            <wp:cNvGraphicFramePr>
+              <a:graphicFrameLocks xmlns:a="http://schemas.openxmlformats.org/drawingml/2006/main" noChangeAspect="1"/>
+            </wp:cNvGraphicFramePr>
+            <a:graphic xmlns:a="http://schemas.openxmlformats.org/drawingml/2006/main">
+              <a:graphicData uri="http://schemas.openxmlformats.org/drawingml/2006/picture">
+                <pic:pic xmlns:pic="http://schemas.openxmlformats.org/drawingml/2006/picture">
+                  <pic:nvPicPr>
+                    <pic:cNvPr id="992045914" name="Afbeelding 5" descr="Afbeelding met Kaartspel, Karmijn, Games, overdekt&#10;&#10;Door AI gegenereerde inhoud is mogelijk onjuist."/>
+                    <pic:cNvPicPr/>
+                  </pic:nvPicPr>
+                  <pic:blipFill>
+                    <a:blip r:embed="rId8">
+                      <a:extLst>
+                        <a:ext uri="{28A0092B-C50C-407E-A947-70E740481C1C}">
+                          <a14:useLocalDpi xmlns:a14="http://schemas.microsoft.com/office/drawing/2010/main" val="0"/>
+                        </a:ext>
+                      </a:extLst>
+                    </a:blip>
+                    <a:stretch>
+                      <a:fillRect/>
+                    </a:stretch>
+                  </pic:blipFill>
+                  <pic:spPr>
+                    <a:xfrm>
+                      <a:off x="0" y="0"/>
+                      <a:ext cx="2027947" cy="3612768"/>
+                    </a:xfrm>
+                    <a:prstGeom prst="rect">
+                      <a:avLst/>
+                    </a:prstGeom>
+                  </pic:spPr>
+                </pic:pic>
+              </a:graphicData>
+            </a:graphic>
+          </wp:inline>
+        </w:drawing>
+      </w:r>
+    </w:p>
+    <w:p>
+      <w:r>
+        <w:rPr>
+          <w:noProof/>
+        </w:rPr>
+        <w:drawing>
+          <wp:inline distT="0" distB="0" distL="0" distR="0" wp14:anchorId="6D46DDFF" wp14:editId="015E3E79">
+            <wp:extent cx="2883599" cy="3962400"/>
+            <wp:effectExtent l="0" t="0" r="0" b="0"/>
+            <wp:docPr id="417798424" name="Afbeelding 6" descr="Afbeelding met Karmijn, overdekt&#10;&#10;Door AI gegenereerde inhoud is mogelijk onjuist."/>
+            <wp:cNvGraphicFramePr>
+              <a:graphicFrameLocks xmlns:a="http://schemas.openxmlformats.org/drawingml/2006/main" noChangeAspect="1"/>
+            </wp:cNvGraphicFramePr>
+            <a:graphic xmlns:a="http://schemas.openxmlformats.org/drawingml/2006/main">
+              <a:graphicData uri="http://schemas.openxmlformats.org/drawingml/2006/picture">
+                <pic:pic xmlns:pic="http://schemas.openxmlformats.org/drawingml/2006/picture">
+                  <pic:nvPicPr>
+                    <pic:cNvPr id="417798424" name="Afbeelding 6" descr="Afbeelding met Karmijn, overdekt&#10;&#10;Door AI gegenereerde inhoud is mogelijk onjuist."/>
+                    <pic:cNvPicPr/>
+                  </pic:nvPicPr>
+                  <pic:blipFill rotWithShape="1">
+                    <a:blip r:embed="rId9">
+                      <a:extLst>
+                        <a:ext uri="{28A0092B-C50C-407E-A947-70E740481C1C}">
+                          <a14:useLocalDpi xmlns:a14="http://schemas.microsoft.com/office/drawing/2010/main" val="0"/>
+                        </a:ext>
+                      </a:extLst>
+                    </a:blip>
+                    <a:srcRect t="12380" b="10487"/>
+                    <a:stretch>
+                      <a:fillRect/>
+                    </a:stretch>
+                  </pic:blipFill>
+                  <pic:spPr bwMode="auto">
+                    <a:xfrm>
+                      <a:off x="0" y="0"/>
+                      <a:ext cx="2895921" cy="3979332"/>
+                    </a:xfrm>
+                    <a:prstGeom prst="rect">
+                      <a:avLst/>
+                    </a:prstGeom>
+                    <a:ln>
+                      <a:noFill/>
+                    </a:ln>
+                    <a:extLst>
+                      <a:ext uri="{53640926-AAD7-44D8-BBD7-CCE9431645EC}">
+                        <a14:shadowObscured xmlns:a14="http://schemas.microsoft.com/office/drawing/2010/main"/>
+                      </a:ext>
+                    </a:extLst>
+                  </pic:spPr>
+                </pic:pic>
+              </a:graphicData>
+            </a:graphic>
+          </wp:inline>
+        </w:drawing>
+      </w:r>
+    </w:p>
     <w:sectPr>
       <w:pgSz w:w="11906" w:h="16838"/>
       <w:pgMar w:top="1440" w:right="1440" w:bottom="1440" w:left="1440" w:header="708" w:footer="708" w:gutter="0"/>
@@ -525,6 +1267,92 @@
     </w:lvl>
   </w:abstractNum>
   <w:abstractNum w:abstractNumId="1" w15:restartNumberingAfterBreak="0">
+    <w:nsid w:val="230F2D44"/>
+    <w:multiLevelType w:val="hybridMultilevel"/>
+    <w:tmpl w:val="9E3C1346"/>
+    <w:lvl w:ilvl="0" w:tplc="0813000F">
+      <w:start w:val="1"/>
+      <w:numFmt w:val="decimal"/>
+      <w:lvlText w:val="%1."/>
+      <w:lvlJc w:val="left"/>
+      <w:pPr>
+        <w:ind w:left="1428" w:hanging="360"/>
+      </w:pPr>
+    </w:lvl>
+    <w:lvl w:ilvl="1" w:tplc="08130019" w:tentative="1">
+      <w:start w:val="1"/>
+      <w:numFmt w:val="lowerLetter"/>
+      <w:lvlText w:val="%2."/>
+      <w:lvlJc w:val="left"/>
+      <w:pPr>
+        <w:ind w:left="2148" w:hanging="360"/>
+      </w:pPr>
+    </w:lvl>
+    <w:lvl w:ilvl="2" w:tplc="0813001B" w:tentative="1">
+      <w:start w:val="1"/>
+      <w:numFmt w:val="lowerRoman"/>
+      <w:lvlText w:val="%3."/>
+      <w:lvlJc w:val="right"/>
+      <w:pPr>
+        <w:ind w:left="2868" w:hanging="180"/>
+      </w:pPr>
+    </w:lvl>
+    <w:lvl w:ilvl="3" w:tplc="0813000F" w:tentative="1">
+      <w:start w:val="1"/>
+      <w:numFmt w:val="decimal"/>
+      <w:lvlText w:val="%4."/>
+      <w:lvlJc w:val="left"/>
+      <w:pPr>
+        <w:ind w:left="3588" w:hanging="360"/>
+      </w:pPr>
+    </w:lvl>
+    <w:lvl w:ilvl="4" w:tplc="08130019" w:tentative="1">
+      <w:start w:val="1"/>
+      <w:numFmt w:val="lowerLetter"/>
+      <w:lvlText w:val="%5."/>
+      <w:lvlJc w:val="left"/>
+      <w:pPr>
+        <w:ind w:left="4308" w:hanging="360"/>
+      </w:pPr>
+    </w:lvl>
+    <w:lvl w:ilvl="5" w:tplc="0813001B" w:tentative="1">
+      <w:start w:val="1"/>
+      <w:numFmt w:val="lowerRoman"/>
+      <w:lvlText w:val="%6."/>
+      <w:lvlJc w:val="right"/>
+      <w:pPr>
+        <w:ind w:left="5028" w:hanging="180"/>
+      </w:pPr>
+    </w:lvl>
+    <w:lvl w:ilvl="6" w:tplc="0813000F" w:tentative="1">
+      <w:start w:val="1"/>
+      <w:numFmt w:val="decimal"/>
+      <w:lvlText w:val="%7."/>
+      <w:lvlJc w:val="left"/>
+      <w:pPr>
+        <w:ind w:left="5748" w:hanging="360"/>
+      </w:pPr>
+    </w:lvl>
+    <w:lvl w:ilvl="7" w:tplc="08130019" w:tentative="1">
+      <w:start w:val="1"/>
+      <w:numFmt w:val="lowerLetter"/>
+      <w:lvlText w:val="%8."/>
+      <w:lvlJc w:val="left"/>
+      <w:pPr>
+        <w:ind w:left="6468" w:hanging="360"/>
+      </w:pPr>
+    </w:lvl>
+    <w:lvl w:ilvl="8" w:tplc="0813001B" w:tentative="1">
+      <w:start w:val="1"/>
+      <w:numFmt w:val="lowerRoman"/>
+      <w:lvlText w:val="%9."/>
+      <w:lvlJc w:val="right"/>
+      <w:pPr>
+        <w:ind w:left="7188" w:hanging="180"/>
+      </w:pPr>
+    </w:lvl>
+  </w:abstractNum>
+  <w:abstractNum w:abstractNumId="2" w15:restartNumberingAfterBreak="0">
     <w:nsid w:val="34DE630E"/>
     <w:multiLevelType w:val="hybridMultilevel"/>
     <w:tmpl w:val="A4B07B50"/>
@@ -613,7 +1441,7 @@
       </w:pPr>
     </w:lvl>
   </w:abstractNum>
-  <w:abstractNum w:abstractNumId="2" w15:restartNumberingAfterBreak="0">
+  <w:abstractNum w:abstractNumId="3" w15:restartNumberingAfterBreak="0">
     <w:nsid w:val="51877160"/>
     <w:multiLevelType w:val="hybridMultilevel"/>
     <w:tmpl w:val="29248E6E"/>
@@ -702,7 +1530,93 @@
       </w:pPr>
     </w:lvl>
   </w:abstractNum>
-  <w:abstractNum w:abstractNumId="3" w15:restartNumberingAfterBreak="0">
+  <w:abstractNum w:abstractNumId="4" w15:restartNumberingAfterBreak="0">
+    <w:nsid w:val="689D1179"/>
+    <w:multiLevelType w:val="hybridMultilevel"/>
+    <w:tmpl w:val="F30CC296"/>
+    <w:lvl w:ilvl="0" w:tplc="0813000F">
+      <w:start w:val="1"/>
+      <w:numFmt w:val="decimal"/>
+      <w:lvlText w:val="%1."/>
+      <w:lvlJc w:val="left"/>
+      <w:pPr>
+        <w:ind w:left="720" w:hanging="360"/>
+      </w:pPr>
+    </w:lvl>
+    <w:lvl w:ilvl="1" w:tplc="08130019" w:tentative="1">
+      <w:start w:val="1"/>
+      <w:numFmt w:val="lowerLetter"/>
+      <w:lvlText w:val="%2."/>
+      <w:lvlJc w:val="left"/>
+      <w:pPr>
+        <w:ind w:left="1440" w:hanging="360"/>
+      </w:pPr>
+    </w:lvl>
+    <w:lvl w:ilvl="2" w:tplc="0813001B" w:tentative="1">
+      <w:start w:val="1"/>
+      <w:numFmt w:val="lowerRoman"/>
+      <w:lvlText w:val="%3."/>
+      <w:lvlJc w:val="right"/>
+      <w:pPr>
+        <w:ind w:left="2160" w:hanging="180"/>
+      </w:pPr>
+    </w:lvl>
+    <w:lvl w:ilvl="3" w:tplc="0813000F" w:tentative="1">
+      <w:start w:val="1"/>
+      <w:numFmt w:val="decimal"/>
+      <w:lvlText w:val="%4."/>
+      <w:lvlJc w:val="left"/>
+      <w:pPr>
+        <w:ind w:left="2880" w:hanging="360"/>
+      </w:pPr>
+    </w:lvl>
+    <w:lvl w:ilvl="4" w:tplc="08130019" w:tentative="1">
+      <w:start w:val="1"/>
+      <w:numFmt w:val="lowerLetter"/>
+      <w:lvlText w:val="%5."/>
+      <w:lvlJc w:val="left"/>
+      <w:pPr>
+        <w:ind w:left="3600" w:hanging="360"/>
+      </w:pPr>
+    </w:lvl>
+    <w:lvl w:ilvl="5" w:tplc="0813001B" w:tentative="1">
+      <w:start w:val="1"/>
+      <w:numFmt w:val="lowerRoman"/>
+      <w:lvlText w:val="%6."/>
+      <w:lvlJc w:val="right"/>
+      <w:pPr>
+        <w:ind w:left="4320" w:hanging="180"/>
+      </w:pPr>
+    </w:lvl>
+    <w:lvl w:ilvl="6" w:tplc="0813000F" w:tentative="1">
+      <w:start w:val="1"/>
+      <w:numFmt w:val="decimal"/>
+      <w:lvlText w:val="%7."/>
+      <w:lvlJc w:val="left"/>
+      <w:pPr>
+        <w:ind w:left="5040" w:hanging="360"/>
+      </w:pPr>
+    </w:lvl>
+    <w:lvl w:ilvl="7" w:tplc="08130019" w:tentative="1">
+      <w:start w:val="1"/>
+      <w:numFmt w:val="lowerLetter"/>
+      <w:lvlText w:val="%8."/>
+      <w:lvlJc w:val="left"/>
+      <w:pPr>
+        <w:ind w:left="5760" w:hanging="360"/>
+      </w:pPr>
+    </w:lvl>
+    <w:lvl w:ilvl="8" w:tplc="0813001B" w:tentative="1">
+      <w:start w:val="1"/>
+      <w:numFmt w:val="lowerRoman"/>
+      <w:lvlText w:val="%9."/>
+      <w:lvlJc w:val="right"/>
+      <w:pPr>
+        <w:ind w:left="6480" w:hanging="180"/>
+      </w:pPr>
+    </w:lvl>
+  </w:abstractNum>
+  <w:abstractNum w:abstractNumId="5" w15:restartNumberingAfterBreak="0">
     <w:nsid w:val="6D5C4078"/>
     <w:multiLevelType w:val="hybridMultilevel"/>
     <w:tmpl w:val="D5C0B5A0"/>
@@ -788,7 +1702,7 @@
       </w:pPr>
     </w:lvl>
   </w:abstractNum>
-  <w:abstractNum w:abstractNumId="4" w15:restartNumberingAfterBreak="0">
+  <w:abstractNum w:abstractNumId="6" w15:restartNumberingAfterBreak="0">
     <w:nsid w:val="7292152F"/>
     <w:multiLevelType w:val="hybridMultilevel"/>
     <w:tmpl w:val="BDA0152E"/>
@@ -881,16 +1795,22 @@
     <w:abstractNumId w:val="0"/>
   </w:num>
   <w:num w:numId="2" w16cid:durableId="680473502">
+    <w:abstractNumId w:val="5"/>
+  </w:num>
+  <w:num w:numId="3" w16cid:durableId="1824658621">
+    <w:abstractNumId w:val="2"/>
+  </w:num>
+  <w:num w:numId="4" w16cid:durableId="1732001578">
+    <w:abstractNumId w:val="6"/>
+  </w:num>
+  <w:num w:numId="5" w16cid:durableId="269629143">
     <w:abstractNumId w:val="3"/>
   </w:num>
-  <w:num w:numId="3" w16cid:durableId="1824658621">
+  <w:num w:numId="6" w16cid:durableId="53627395">
     <w:abstractNumId w:val="1"/>
   </w:num>
-  <w:num w:numId="4" w16cid:durableId="1732001578">
+  <w:num w:numId="7" w16cid:durableId="733822799">
     <w:abstractNumId w:val="4"/>
-  </w:num>
-  <w:num w:numId="5" w16cid:durableId="269629143">
-    <w:abstractNumId w:val="2"/>
   </w:num>
 </w:numbering>
 </file>
@@ -2143,4 +3063,16 @@
     </a:ext>
   </a:extLst>
 </a:theme>
+</file>
+
+<file path=customXml/item1.xml><?xml version="1.0" encoding="utf-8"?>
+<b:Sources xmlns:b="http://schemas.openxmlformats.org/officeDocument/2006/bibliography" xmlns="http://schemas.openxmlformats.org/officeDocument/2006/bibliography" SelectedStyle="\APASixthEditionOfficeOnline.xsl" StyleName="APA" Version="6"/>
+</file>
+
+<file path=customXml/itemProps1.xml><?xml version="1.0" encoding="utf-8"?>
+<ds:datastoreItem xmlns:ds="http://schemas.openxmlformats.org/officeDocument/2006/customXml" ds:itemID="{0B1F80B5-07A5-4EAE-B4EF-986BDBE93A14}">
+  <ds:schemaRefs>
+    <ds:schemaRef ds:uri="http://schemas.openxmlformats.org/officeDocument/2006/bibliography"/>
+  </ds:schemaRefs>
+</ds:datastoreItem>
 </file>
</xml_diff>

<commit_message>
updated to show itch.io website password
</commit_message>
<xml_diff>
--- a/Buildings of DOOM.docx
+++ b/Buildings of DOOM.docx
@@ -39,6 +39,11 @@
         </w:r>
       </w:hyperlink>
     </w:p>
+    <w:p>
+      <w:r>
+        <w:t>(wachtwoord: IMT)</w:t>
+      </w:r>
+    </w:p>
     <w:p/>
     <w:p>
       <w:pPr>
@@ -331,7 +336,6 @@
         <w:rPr>
           <w:u w:val="single"/>
         </w:rPr>
-        <w:lastRenderedPageBreak/>
         <w:t>Spelverloop:</w:t>
       </w:r>
     </w:p>
@@ -956,12 +960,12 @@
     <w:p/>
     <w:p>
       <w:r>
+        <w:lastRenderedPageBreak/>
         <w:t xml:space="preserve">Eerste versie van het spel moest je met een voorwerp de gebouwen omschieten met het gebruik van je vingers om het af te vuren. </w:t>
       </w:r>
     </w:p>
     <w:p>
       <w:r>
-        <w:lastRenderedPageBreak/>
         <w:t>Dit is volledig weg gedaan en vervangen met dobbelstenen en kaarten.</w:t>
       </w:r>
     </w:p>
@@ -1089,6 +1093,7 @@
         <w:rPr>
           <w:noProof/>
         </w:rPr>
+        <w:lastRenderedPageBreak/>
         <w:drawing>
           <wp:inline distT="0" distB="0" distL="0" distR="0" wp14:anchorId="6D46DDFF" wp14:editId="015E3E79">
             <wp:extent cx="2883599" cy="3962400"/>

</xml_diff>